<commit_message>
docs: maj documentation Word avec le filtre ADX (config finale)
https://claude.ai/code/session_01EWmpUwmNrYNLATaL8hzgNg
</commit_message>
<xml_diff>
--- a/docs/EA_FusionBTC_Documentation.docx
+++ b/docs/EA_FusionBTC_Documentation.docx
@@ -215,7 +215,7 @@
               <w:rPr>
                 <w:b/>
               </w:rPr>
-              <w:t>Timeframe</w:t>
+              <w:t>Configuration</w:t>
             </w:r>
           </w:p>
         </w:tc>
@@ -299,7 +299,7 @@
               <w:rPr>
                 <w:b/>
               </w:rPr>
-              <w:t>OOS</w:t>
+              <w:t>Walk-forward</w:t>
             </w:r>
           </w:p>
         </w:tc>
@@ -311,7 +311,79 @@
           </w:tcPr>
           <w:p>
             <w:r>
-              <w:t>M30 (défaut)</w:t>
+              <w:t>M30 + ADX&gt;20 (défaut)</w:t>
+            </w:r>
+          </w:p>
+        </w:tc>
+        <w:tc>
+          <w:tcPr>
+            <w:tcW w:type="dxa" w:w="1234"/>
+          </w:tcPr>
+          <w:p>
+            <w:r>
+              <w:t>1.57</w:t>
+            </w:r>
+          </w:p>
+        </w:tc>
+        <w:tc>
+          <w:tcPr>
+            <w:tcW w:type="dxa" w:w="1234"/>
+          </w:tcPr>
+          <w:p>
+            <w:r>
+              <w:t>6.6 %</w:t>
+            </w:r>
+          </w:p>
+        </w:tc>
+        <w:tc>
+          <w:tcPr>
+            <w:tcW w:type="dxa" w:w="1234"/>
+          </w:tcPr>
+          <w:p>
+            <w:r>
+              <w:t>+50 %</w:t>
+            </w:r>
+          </w:p>
+        </w:tc>
+        <w:tc>
+          <w:tcPr>
+            <w:tcW w:type="dxa" w:w="1234"/>
+          </w:tcPr>
+          <w:p>
+            <w:r>
+              <w:t>157</w:t>
+            </w:r>
+          </w:p>
+        </w:tc>
+        <w:tc>
+          <w:tcPr>
+            <w:tcW w:type="dxa" w:w="1234"/>
+          </w:tcPr>
+          <w:p>
+            <w:r>
+              <w:t>56.7 %</w:t>
+            </w:r>
+          </w:p>
+        </w:tc>
+        <w:tc>
+          <w:tcPr>
+            <w:tcW w:type="dxa" w:w="1234"/>
+          </w:tcPr>
+          <w:p>
+            <w:r>
+              <w:t>6/6 fenêtres +</w:t>
+            </w:r>
+          </w:p>
+        </w:tc>
+      </w:tr>
+      <w:tr>
+        <w:tc>
+          <w:tcPr>
+            <w:tcW w:type="dxa" w:w="1234"/>
+          </w:tcPr>
+          <w:p>
+            <w:r>
+              <w:t>M30 sans ADX</w:t>
             </w:r>
           </w:p>
         </w:tc>
@@ -371,7 +443,7 @@
           </w:tcPr>
           <w:p>
             <w:r>
-              <w:t>PF 1.84 (69 trades)</w:t>
+              <w:t>5/6 fenêtres +</w:t>
             </w:r>
           </w:p>
         </w:tc>
@@ -383,7 +455,7 @@
           </w:tcPr>
           <w:p>
             <w:r>
-              <w:t>H1 (alternative)</w:t>
+              <w:t>H1 (alternative bas DD)</w:t>
             </w:r>
           </w:p>
         </w:tc>
@@ -443,7 +515,7 @@
           </w:tcPr>
           <w:p>
             <w:r>
-              <w:t>PF 2.55 (27 trades)</w:t>
+              <w:t>5/6 fenêtres +</w:t>
             </w:r>
           </w:p>
         </w:tc>
@@ -617,6 +689,24 @@
           <w:i w:val="0"/>
         </w:rPr>
         <w:t>Le robot exige la présence récente d'un « gap d'inefficience » (déséquilibre de prix laissé par un mouvement institutionnel) dans le sens du trade. C'est le seul affinage de type Smart Money qui a amélioré le système de façon robuste lors des tests (les concepts OTE, IPDA et engulfing, eux, étranglaient le nombre de trades sans gain net — ils ont donc été écartés).</w:t>
+      </w:r>
+    </w:p>
+    <w:p>
+      <w:r>
+        <w:rPr>
+          <w:b/>
+          <w:i w:val="0"/>
+        </w:rPr>
+        <w:t>Filtre n°3 — ADX (force de tendance) :</w:t>
+      </w:r>
+    </w:p>
+    <w:p>
+      <w:r>
+        <w:rPr>
+          <w:b w:val="0"/>
+          <w:i w:val="0"/>
+        </w:rPr>
+        <w:t>L'ADX mesure la PUISSANCE de la tendance (pas sa direction). Le robot n'entre que si l'ADX dépasse 20 : il évite ainsi les marchés qui hésitent (range), où un suivi de tendance perd de l'argent. Ce filtre a été ajouté après validation : il fait passer le profit factor de 1.39 à 1.57 et réduit le drawdown de 9.7 % à 6.6 %, avec 6 fenêtres walk-forward profitables sur 6. (Le filtre de volume, lui, a été testé puis écarté car il n'apportait rien sur Bitcoin.)</w:t>
       </w:r>
     </w:p>
     <w:p>
@@ -1009,6 +1099,70 @@
           <w:p>
             <w:r>
               <w:t>Nombre de bougies où chercher un FVG</w:t>
+            </w:r>
+          </w:p>
+        </w:tc>
+      </w:tr>
+      <w:tr>
+        <w:tc>
+          <w:tcPr>
+            <w:tcW w:type="dxa" w:w="2880"/>
+          </w:tcPr>
+          <w:p>
+            <w:r>
+              <w:t>UseADXFilter</w:t>
+            </w:r>
+          </w:p>
+        </w:tc>
+        <w:tc>
+          <w:tcPr>
+            <w:tcW w:type="dxa" w:w="2880"/>
+          </w:tcPr>
+          <w:p>
+            <w:r>
+              <w:t>true</w:t>
+            </w:r>
+          </w:p>
+        </w:tc>
+        <w:tc>
+          <w:tcPr>
+            <w:tcW w:type="dxa" w:w="2880"/>
+          </w:tcPr>
+          <w:p>
+            <w:r>
+              <w:t>Exige une tendance forte (ADX) — boost validé</w:t>
+            </w:r>
+          </w:p>
+        </w:tc>
+      </w:tr>
+      <w:tr>
+        <w:tc>
+          <w:tcPr>
+            <w:tcW w:type="dxa" w:w="2880"/>
+          </w:tcPr>
+          <w:p>
+            <w:r>
+              <w:t>ADX_MinValue</w:t>
+            </w:r>
+          </w:p>
+        </w:tc>
+        <w:tc>
+          <w:tcPr>
+            <w:tcW w:type="dxa" w:w="2880"/>
+          </w:tcPr>
+          <w:p>
+            <w:r>
+              <w:t>20.0</w:t>
+            </w:r>
+          </w:p>
+        </w:tc>
+        <w:tc>
+          <w:tcPr>
+            <w:tcW w:type="dxa" w:w="2880"/>
+          </w:tcPr>
+          <w:p>
+            <w:r>
+              <w:t>Seuil ADX (20 optimal ; au-delà de 25 la régularité baisse)</w:t>
             </w:r>
           </w:p>
         </w:tc>

</xml_diff>